<commit_message>
Enhance system monitoring and error reporting capabilities
Adds a detailed health check endpoint, client-side error reporting, and an audit log archiving script.

Replit-Commit-Author: Agent
Replit-Commit-Session-Id: 023a983f-7666-4005-8f1f-15e7e2294c87
Replit-Commit-Checkpoint-Type: full_checkpoint
Replit-Commit-Event-Id: 6e86956a-dee0-403c-92a5-03cd73bb8ffc
Replit-Commit-Screenshot-Url: https://storage.googleapis.com/screenshot-production-us-central1/066e05bb-42f5-4743-94c7-df5af828948c/023a983f-7666-4005-8f1f-15e7e2294c87/9ltBiCf
Replit-Helium-Checkpoint-Created: true
</commit_message>
<xml_diff>
--- a/TEKNIK_DOKUMAN.docx
+++ b/TEKNIK_DOKUMAN.docx
@@ -8289,6 +8289,47 @@
                 <w:bCs/>
               </w:rPr>
               <w:t xml:space="preserve">Önemli Değişiklikler</w:t>
+            </w:r>
+          </w:p>
+        </w:tc>
+      </w:tr>
+      <w:tr>
+        <w:tc>
+          <w:tcPr>
+            <w:tcW w:type="dxa" w:w="3000"/>
+          </w:tcPr>
+          <w:p>
+            <w:pPr>
+              <w:spacing w:after="60" w:before="60"/>
+            </w:pPr>
+            <w:r>
+              <w:t xml:space="preserve">1.1.0</w:t>
+            </w:r>
+          </w:p>
+        </w:tc>
+        <w:tc>
+          <w:tcPr>
+            <w:tcW w:type="dxa" w:w="3000"/>
+          </w:tcPr>
+          <w:p>
+            <w:pPr>
+              <w:spacing w:after="60" w:before="60"/>
+            </w:pPr>
+            <w:r>
+              <w:t xml:space="preserve">2026-04-18</w:t>
+            </w:r>
+          </w:p>
+        </w:tc>
+        <w:tc>
+          <w:tcPr>
+            <w:tcW w:type="dxa" w:w="3000"/>
+          </w:tcPr>
+          <w:p>
+            <w:pPr>
+              <w:spacing w:after="60" w:before="60"/>
+            </w:pPr>
+            <w:r>
+              <w:t xml:space="preserve">Detaylı health check (DB+Storage+SMTP), Frontend ErrorBoundary + client-error API, Audit log arşivleme script</w:t>
             </w:r>
           </w:p>
         </w:tc>

</xml_diff>

<commit_message>
Update technical documentation with recent system changes
Update TEKNIK_DOKUMAN.md and TEKNIK_DOKUMAN.docx to reflect Sprint 82 changes, including password reset functionality, UI updates, and screenshot generation infrastructure.

Replit-Commit-Author: Agent
Replit-Commit-Session-Id: 023a983f-7666-4005-8f1f-15e7e2294c87
Replit-Commit-Checkpoint-Type: full_checkpoint
Replit-Commit-Event-Id: 24b8b3b0-95ac-464f-bf38-969d18f22038
Replit-Commit-Screenshot-Url: https://storage.googleapis.com/screenshot-production-us-central1/066e05bb-42f5-4743-94c7-df5af828948c/023a983f-7666-4005-8f1f-15e7e2294c87/sn30hP8
Replit-Helium-Checkpoint-Created: true
</commit_message>
<xml_diff>
--- a/TEKNIK_DOKUMAN.docx
+++ b/TEKNIK_DOKUMAN.docx
@@ -23,7 +23,7 @@
         <w:t xml:space="preserve">Sürüm:</w:t>
       </w:r>
       <w:r>
-        <w:t xml:space="preserve"> 1.0.0 — Canlıya Hazır   </w:t>
+        <w:t xml:space="preserve"> 1.2.0 — Sprint 82 (UX/UI + Auth Overhaul)   </w:t>
       </w:r>
       <w:r>
         <w:rPr>
@@ -8214,7 +8214,54 @@
         <w:spacing w:after="120" w:before="240"/>
       </w:pPr>
       <w:r>
-        <w:t xml:space="preserve">21. Sürüm Geçmişi (Özet)</w:t>
+        <w:t xml:space="preserve">21. Sprint 82 — UX/UI + Auth Overhaul (Nisan 2026)</w:t>
+      </w:r>
+    </w:p>
+    <w:p>
+      <w:pPr>
+        <w:spacing w:after="120"/>
+      </w:pPr>
+      <w:r>
+        <w:t xml:space="preserve">Sprint 82, kullanıcının "platform göze hoş gelmeli, login modern olmalı, şifremi unuttum gerçek olmalı" talebine yanıt veren büyük bir görsel/güvenlik elden geçirmesidir.</w:t>
+      </w:r>
+    </w:p>
+    <w:p>
+      <w:pPr>
+        <w:pStyle w:val="Heading3"/>
+        <w:spacing w:after="120" w:before="240"/>
+      </w:pPr>
+      <w:r>
+        <w:t xml:space="preserve">21.1 Şifremi Unuttum Akışı (SMS Tabanlı)</w:t>
+      </w:r>
+    </w:p>
+    <w:p>
+      <w:pPr>
+        <w:spacing w:after="120"/>
+      </w:pPr>
+      <w:r>
+        <w:t xml:space="preserve">3 adımlı sihirbaz: telefon → 6 haneli OTP → yeni şifre.</w:t>
+      </w:r>
+    </w:p>
+    <w:p>
+      <w:pPr>
+        <w:spacing w:after="120"/>
+      </w:pPr>
+      <w:r>
+        <w:rPr>
+          <w:b/>
+          <w:bCs/>
+        </w:rPr>
+        <w:t xml:space="preserve">Yeni tablo:</w:t>
+      </w:r>
+      <w:r>
+        <w:t xml:space="preserve"> </w:t>
+      </w:r>
+      <w:r>
+        <w:rPr>
+          <w:rFonts w:ascii="Consolas" w:cs="Consolas" w:eastAsia="Consolas" w:hAnsi="Consolas"/>
+          <w:shd w:fill="F1F5F9" w:color="F1F5F9" w:val="solid"/>
+        </w:rPr>
+        <w:t xml:space="preserve">password_reset_tokens</w:t>
       </w:r>
     </w:p>
     <w:tbl>
@@ -8252,6 +8299,1001 @@
                 <w:b/>
                 <w:bCs/>
               </w:rPr>
+              <w:t xml:space="preserve">Sütun</w:t>
+            </w:r>
+          </w:p>
+        </w:tc>
+        <w:tc>
+          <w:tcPr>
+            <w:tcW w:type="dxa" w:w="3000"/>
+            <w:shd w:fill="0F172A" w:color="0F172A" w:val="solid"/>
+          </w:tcPr>
+          <w:p>
+            <w:pPr>
+              <w:spacing w:after="60" w:before="60"/>
+            </w:pPr>
+            <w:r>
+              <w:rPr>
+                <w:b/>
+                <w:bCs/>
+              </w:rPr>
+              <w:t xml:space="preserve">Tip</w:t>
+            </w:r>
+          </w:p>
+        </w:tc>
+        <w:tc>
+          <w:tcPr>
+            <w:tcW w:type="dxa" w:w="3000"/>
+            <w:shd w:fill="0F172A" w:color="0F172A" w:val="solid"/>
+          </w:tcPr>
+          <w:p>
+            <w:pPr>
+              <w:spacing w:after="60" w:before="60"/>
+            </w:pPr>
+            <w:r>
+              <w:rPr>
+                <w:b/>
+                <w:bCs/>
+              </w:rPr>
+              <w:t xml:space="preserve">Açıklama</w:t>
+            </w:r>
+          </w:p>
+        </w:tc>
+      </w:tr>
+      <w:tr>
+        <w:tc>
+          <w:tcPr>
+            <w:tcW w:type="dxa" w:w="3000"/>
+          </w:tcPr>
+          <w:p>
+            <w:pPr>
+              <w:spacing w:after="60" w:before="60"/>
+            </w:pPr>
+            <w:r>
+              <w:rPr>
+                <w:rFonts w:ascii="Consolas" w:cs="Consolas" w:eastAsia="Consolas" w:hAnsi="Consolas"/>
+                <w:shd w:fill="F1F5F9" w:color="F1F5F9" w:val="solid"/>
+              </w:rPr>
+              <w:t xml:space="preserve">id</w:t>
+            </w:r>
+          </w:p>
+        </w:tc>
+        <w:tc>
+          <w:tcPr>
+            <w:tcW w:type="dxa" w:w="3000"/>
+          </w:tcPr>
+          <w:p>
+            <w:pPr>
+              <w:spacing w:after="60" w:before="60"/>
+            </w:pPr>
+            <w:r>
+              <w:t xml:space="preserve">serial</w:t>
+            </w:r>
+          </w:p>
+        </w:tc>
+        <w:tc>
+          <w:tcPr>
+            <w:tcW w:type="dxa" w:w="3000"/>
+          </w:tcPr>
+          <w:p>
+            <w:pPr>
+              <w:spacing w:after="60" w:before="60"/>
+            </w:pPr>
+            <w:r>
+              <w:t xml:space="preserve">PK</w:t>
+            </w:r>
+          </w:p>
+        </w:tc>
+      </w:tr>
+      <w:tr>
+        <w:tc>
+          <w:tcPr>
+            <w:tcW w:type="dxa" w:w="3000"/>
+          </w:tcPr>
+          <w:p>
+            <w:pPr>
+              <w:spacing w:after="60" w:before="60"/>
+            </w:pPr>
+            <w:r>
+              <w:rPr>
+                <w:rFonts w:ascii="Consolas" w:cs="Consolas" w:eastAsia="Consolas" w:hAnsi="Consolas"/>
+                <w:shd w:fill="F1F5F9" w:color="F1F5F9" w:val="solid"/>
+              </w:rPr>
+              <w:t xml:space="preserve">user_id</w:t>
+            </w:r>
+          </w:p>
+        </w:tc>
+        <w:tc>
+          <w:tcPr>
+            <w:tcW w:type="dxa" w:w="3000"/>
+          </w:tcPr>
+          <w:p>
+            <w:pPr>
+              <w:spacing w:after="60" w:before="60"/>
+            </w:pPr>
+            <w:r>
+              <w:t xml:space="preserve">int FK users</w:t>
+            </w:r>
+          </w:p>
+        </w:tc>
+        <w:tc>
+          <w:tcPr>
+            <w:tcW w:type="dxa" w:w="3000"/>
+          </w:tcPr>
+          <w:p>
+            <w:pPr>
+              <w:spacing w:after="60" w:before="60"/>
+            </w:pPr>
+            <w:r>
+              <w:t xml:space="preserve">Hangi kullanıcı</w:t>
+            </w:r>
+          </w:p>
+        </w:tc>
+      </w:tr>
+      <w:tr>
+        <w:tc>
+          <w:tcPr>
+            <w:tcW w:type="dxa" w:w="3000"/>
+          </w:tcPr>
+          <w:p>
+            <w:pPr>
+              <w:spacing w:after="60" w:before="60"/>
+            </w:pPr>
+            <w:r>
+              <w:rPr>
+                <w:rFonts w:ascii="Consolas" w:cs="Consolas" w:eastAsia="Consolas" w:hAnsi="Consolas"/>
+                <w:shd w:fill="F1F5F9" w:color="F1F5F9" w:val="solid"/>
+              </w:rPr>
+              <w:t xml:space="preserve">company_id</w:t>
+            </w:r>
+          </w:p>
+        </w:tc>
+        <w:tc>
+          <w:tcPr>
+            <w:tcW w:type="dxa" w:w="3000"/>
+          </w:tcPr>
+          <w:p>
+            <w:pPr>
+              <w:spacing w:after="60" w:before="60"/>
+            </w:pPr>
+            <w:r>
+              <w:t xml:space="preserve">int FK companies</w:t>
+            </w:r>
+          </w:p>
+        </w:tc>
+        <w:tc>
+          <w:tcPr>
+            <w:tcW w:type="dxa" w:w="3000"/>
+          </w:tcPr>
+          <w:p>
+            <w:pPr>
+              <w:spacing w:after="60" w:before="60"/>
+            </w:pPr>
+            <w:r>
+              <w:t xml:space="preserve">Tenant izolasyonu</w:t>
+            </w:r>
+          </w:p>
+        </w:tc>
+      </w:tr>
+      <w:tr>
+        <w:tc>
+          <w:tcPr>
+            <w:tcW w:type="dxa" w:w="3000"/>
+          </w:tcPr>
+          <w:p>
+            <w:pPr>
+              <w:spacing w:after="60" w:before="60"/>
+            </w:pPr>
+            <w:r>
+              <w:rPr>
+                <w:rFonts w:ascii="Consolas" w:cs="Consolas" w:eastAsia="Consolas" w:hAnsi="Consolas"/>
+                <w:shd w:fill="F1F5F9" w:color="F1F5F9" w:val="solid"/>
+              </w:rPr>
+              <w:t xml:space="preserve">token_hash</w:t>
+            </w:r>
+          </w:p>
+        </w:tc>
+        <w:tc>
+          <w:tcPr>
+            <w:tcW w:type="dxa" w:w="3000"/>
+          </w:tcPr>
+          <w:p>
+            <w:pPr>
+              <w:spacing w:after="60" w:before="60"/>
+            </w:pPr>
+            <w:r>
+              <w:t xml:space="preserve">varchar(255)</w:t>
+            </w:r>
+          </w:p>
+        </w:tc>
+        <w:tc>
+          <w:tcPr>
+            <w:tcW w:type="dxa" w:w="3000"/>
+          </w:tcPr>
+          <w:p>
+            <w:pPr>
+              <w:spacing w:after="60" w:before="60"/>
+            </w:pPr>
+            <w:r>
+              <w:t xml:space="preserve">bcrypt hash (raw OTP DB'de yok)</w:t>
+            </w:r>
+          </w:p>
+        </w:tc>
+      </w:tr>
+      <w:tr>
+        <w:tc>
+          <w:tcPr>
+            <w:tcW w:type="dxa" w:w="3000"/>
+          </w:tcPr>
+          <w:p>
+            <w:pPr>
+              <w:spacing w:after="60" w:before="60"/>
+            </w:pPr>
+            <w:r>
+              <w:rPr>
+                <w:rFonts w:ascii="Consolas" w:cs="Consolas" w:eastAsia="Consolas" w:hAnsi="Consolas"/>
+                <w:shd w:fill="F1F5F9" w:color="F1F5F9" w:val="solid"/>
+              </w:rPr>
+              <w:t xml:space="preserve">expires_at</w:t>
+            </w:r>
+          </w:p>
+        </w:tc>
+        <w:tc>
+          <w:tcPr>
+            <w:tcW w:type="dxa" w:w="3000"/>
+          </w:tcPr>
+          <w:p>
+            <w:pPr>
+              <w:spacing w:after="60" w:before="60"/>
+            </w:pPr>
+            <w:r>
+              <w:t xml:space="preserve">timestamptz</w:t>
+            </w:r>
+          </w:p>
+        </w:tc>
+        <w:tc>
+          <w:tcPr>
+            <w:tcW w:type="dxa" w:w="3000"/>
+          </w:tcPr>
+          <w:p>
+            <w:pPr>
+              <w:spacing w:after="60" w:before="60"/>
+            </w:pPr>
+            <w:r>
+              <w:t xml:space="preserve">10 dk geçerlilik</w:t>
+            </w:r>
+          </w:p>
+        </w:tc>
+      </w:tr>
+      <w:tr>
+        <w:tc>
+          <w:tcPr>
+            <w:tcW w:type="dxa" w:w="3000"/>
+          </w:tcPr>
+          <w:p>
+            <w:pPr>
+              <w:spacing w:after="60" w:before="60"/>
+            </w:pPr>
+            <w:r>
+              <w:rPr>
+                <w:rFonts w:ascii="Consolas" w:cs="Consolas" w:eastAsia="Consolas" w:hAnsi="Consolas"/>
+                <w:shd w:fill="F1F5F9" w:color="F1F5F9" w:val="solid"/>
+              </w:rPr>
+              <w:t xml:space="preserve">consumed_at</w:t>
+            </w:r>
+          </w:p>
+        </w:tc>
+        <w:tc>
+          <w:tcPr>
+            <w:tcW w:type="dxa" w:w="3000"/>
+          </w:tcPr>
+          <w:p>
+            <w:pPr>
+              <w:spacing w:after="60" w:before="60"/>
+            </w:pPr>
+            <w:r>
+              <w:t xml:space="preserve">timestamptz</w:t>
+            </w:r>
+          </w:p>
+        </w:tc>
+        <w:tc>
+          <w:tcPr>
+            <w:tcW w:type="dxa" w:w="3000"/>
+          </w:tcPr>
+          <w:p>
+            <w:pPr>
+              <w:spacing w:after="60" w:before="60"/>
+            </w:pPr>
+            <w:r>
+              <w:t xml:space="preserve">Atomic tüketim — tek kullanım</w:t>
+            </w:r>
+          </w:p>
+        </w:tc>
+      </w:tr>
+      <w:tr>
+        <w:tc>
+          <w:tcPr>
+            <w:tcW w:type="dxa" w:w="3000"/>
+          </w:tcPr>
+          <w:p>
+            <w:pPr>
+              <w:spacing w:after="60" w:before="60"/>
+            </w:pPr>
+            <w:r>
+              <w:rPr>
+                <w:rFonts w:ascii="Consolas" w:cs="Consolas" w:eastAsia="Consolas" w:hAnsi="Consolas"/>
+                <w:shd w:fill="F1F5F9" w:color="F1F5F9" w:val="solid"/>
+              </w:rPr>
+              <w:t xml:space="preserve">attempts</w:t>
+            </w:r>
+          </w:p>
+        </w:tc>
+        <w:tc>
+          <w:tcPr>
+            <w:tcW w:type="dxa" w:w="3000"/>
+          </w:tcPr>
+          <w:p>
+            <w:pPr>
+              <w:spacing w:after="60" w:before="60"/>
+            </w:pPr>
+            <w:r>
+              <w:t xml:space="preserve">int</w:t>
+            </w:r>
+          </w:p>
+        </w:tc>
+        <w:tc>
+          <w:tcPr>
+            <w:tcW w:type="dxa" w:w="3000"/>
+          </w:tcPr>
+          <w:p>
+            <w:pPr>
+              <w:spacing w:after="60" w:before="60"/>
+            </w:pPr>
+            <w:r>
+              <w:t xml:space="preserve">Brute-force sayacı</w:t>
+            </w:r>
+          </w:p>
+        </w:tc>
+      </w:tr>
+      <w:tr>
+        <w:tc>
+          <w:tcPr>
+            <w:tcW w:type="dxa" w:w="3000"/>
+          </w:tcPr>
+          <w:p>
+            <w:pPr>
+              <w:spacing w:after="60" w:before="60"/>
+            </w:pPr>
+            <w:r>
+              <w:rPr>
+                <w:rFonts w:ascii="Consolas" w:cs="Consolas" w:eastAsia="Consolas" w:hAnsi="Consolas"/>
+                <w:shd w:fill="F1F5F9" w:color="F1F5F9" w:val="solid"/>
+              </w:rPr>
+              <w:t xml:space="preserve">created_at</w:t>
+            </w:r>
+          </w:p>
+        </w:tc>
+        <w:tc>
+          <w:tcPr>
+            <w:tcW w:type="dxa" w:w="3000"/>
+          </w:tcPr>
+          <w:p>
+            <w:pPr>
+              <w:spacing w:after="60" w:before="60"/>
+            </w:pPr>
+            <w:r>
+              <w:t xml:space="preserve">timestamptz</w:t>
+            </w:r>
+          </w:p>
+        </w:tc>
+        <w:tc>
+          <w:tcPr>
+            <w:tcW w:type="dxa" w:w="3000"/>
+          </w:tcPr>
+          <w:p>
+            <w:pPr>
+              <w:spacing w:after="60" w:before="60"/>
+            </w:pPr>
+            <w:r>
+              <w:t xml:space="preserve">Audit</w:t>
+            </w:r>
+          </w:p>
+        </w:tc>
+      </w:tr>
+    </w:tbl>
+    <w:p>
+      <w:pPr>
+        <w:spacing w:after="120"/>
+      </w:pPr>
+      <w:r>
+        <w:t xml:space="preserve"> </w:t>
+      </w:r>
+    </w:p>
+    <w:p>
+      <w:pPr>
+        <w:spacing w:after="120"/>
+      </w:pPr>
+      <w:r>
+        <w:rPr>
+          <w:b/>
+          <w:bCs/>
+        </w:rPr>
+        <w:t xml:space="preserve">Endpoint'ler</w:t>
+      </w:r>
+      <w:r>
+        <w:t xml:space="preserve"> (</w:t>
+      </w:r>
+      <w:r>
+        <w:rPr>
+          <w:rFonts w:ascii="Consolas" w:cs="Consolas" w:eastAsia="Consolas" w:hAnsi="Consolas"/>
+          <w:shd w:fill="F1F5F9" w:color="F1F5F9" w:val="solid"/>
+        </w:rPr>
+        <w:t xml:space="preserve">artifacts/api-server/src/routes/auth.ts</w:t>
+      </w:r>
+      <w:r>
+        <w:t xml:space="preserve">):</w:t>
+      </w:r>
+    </w:p>
+    <w:p>
+      <w:pPr>
+        <w:spacing w:after="60"/>
+        <w:ind w:left="360"/>
+      </w:pPr>
+      <w:r>
+        <w:t xml:space="preserve">•  </w:t>
+      </w:r>
+      <w:r>
+        <w:rPr>
+          <w:rFonts w:ascii="Consolas" w:cs="Consolas" w:eastAsia="Consolas" w:hAnsi="Consolas"/>
+          <w:shd w:fill="F1F5F9" w:color="F1F5F9" w:val="solid"/>
+        </w:rPr>
+        <w:t xml:space="preserve">POST /api/auth/forgot-password/request</w:t>
+      </w:r>
+      <w:r>
+        <w:t xml:space="preserve"> — Telefon alır, kullanıcıyı bulur, OTP üretir, NetGSM SMS sağlayıcısına yollar. </w:t>
+      </w:r>
+      <w:r>
+        <w:rPr>
+          <w:b/>
+          <w:bCs/>
+        </w:rPr>
+        <w:t xml:space="preserve">Enumeration koruması:</w:t>
+      </w:r>
+      <w:r>
+        <w:t xml:space="preserve"> kullanıcı bulunamasa bile her zaman 200 döner.</w:t>
+      </w:r>
+    </w:p>
+    <w:p>
+      <w:pPr>
+        <w:spacing w:after="60"/>
+        <w:ind w:left="360"/>
+      </w:pPr>
+      <w:r>
+        <w:t xml:space="preserve">•  </w:t>
+      </w:r>
+      <w:r>
+        <w:rPr>
+          <w:rFonts w:ascii="Consolas" w:cs="Consolas" w:eastAsia="Consolas" w:hAnsi="Consolas"/>
+          <w:shd w:fill="F1F5F9" w:color="F1F5F9" w:val="solid"/>
+        </w:rPr>
+        <w:t xml:space="preserve">POST /api/auth/forgot-password/verify</w:t>
+      </w:r>
+      <w:r>
+        <w:t xml:space="preserve"> — OTP doğrulama. Yanlış → </w:t>
+      </w:r>
+      <w:r>
+        <w:rPr>
+          <w:rFonts w:ascii="Consolas" w:cs="Consolas" w:eastAsia="Consolas" w:hAnsi="Consolas"/>
+          <w:shd w:fill="F1F5F9" w:color="F1F5F9" w:val="solid"/>
+        </w:rPr>
+        <w:t xml:space="preserve">attempts++</w:t>
+      </w:r>
+      <w:r>
+        <w:t xml:space="preserve">. 5 başarısızlıkta token iptal.</w:t>
+      </w:r>
+    </w:p>
+    <w:p>
+      <w:pPr>
+        <w:spacing w:after="60"/>
+        <w:ind w:left="360"/>
+      </w:pPr>
+      <w:r>
+        <w:t xml:space="preserve">•  </w:t>
+      </w:r>
+      <w:r>
+        <w:rPr>
+          <w:rFonts w:ascii="Consolas" w:cs="Consolas" w:eastAsia="Consolas" w:hAnsi="Consolas"/>
+          <w:shd w:fill="F1F5F9" w:color="F1F5F9" w:val="solid"/>
+        </w:rPr>
+        <w:t xml:space="preserve">POST /api/auth/forgot-password/reset</w:t>
+      </w:r>
+      <w:r>
+        <w:t xml:space="preserve"> — Tek-seferlik OTP ile yeni şifre belirleme. </w:t>
+      </w:r>
+      <w:r>
+        <w:rPr>
+          <w:rFonts w:ascii="Consolas" w:cs="Consolas" w:eastAsia="Consolas" w:hAnsi="Consolas"/>
+          <w:shd w:fill="F1F5F9" w:color="F1F5F9" w:val="solid"/>
+        </w:rPr>
+        <w:t xml:space="preserve">consumed_at</w:t>
+      </w:r>
+      <w:r>
+        <w:t xml:space="preserve"> atomik UPDATE ile set edilir.</w:t>
+      </w:r>
+    </w:p>
+    <w:p>
+      <w:pPr>
+        <w:spacing w:after="120"/>
+      </w:pPr>
+      <w:r>
+        <w:rPr>
+          <w:b/>
+          <w:bCs/>
+        </w:rPr>
+        <w:t xml:space="preserve">Rate limit:</w:t>
+      </w:r>
+      <w:r>
+        <w:t xml:space="preserve"> IP başına 5 talep / 15 dk + telefon başına 3 talep / saat.</w:t>
+      </w:r>
+    </w:p>
+    <w:p>
+      <w:pPr>
+        <w:spacing w:after="120"/>
+      </w:pPr>
+      <w:r>
+        <w:rPr>
+          <w:b/>
+          <w:bCs/>
+        </w:rPr>
+        <w:t xml:space="preserve">Loglama:</w:t>
+      </w:r>
+      <w:r>
+        <w:t xml:space="preserve"> Production'da OTP </w:t>
+      </w:r>
+      <w:r>
+        <w:rPr>
+          <w:b/>
+          <w:bCs/>
+        </w:rPr>
+        <w:t xml:space="preserve">asla</w:t>
+      </w:r>
+      <w:r>
+        <w:t xml:space="preserve"> log'a yazılmaz; geliştirme modunda </w:t>
+      </w:r>
+      <w:r>
+        <w:rPr>
+          <w:rFonts w:ascii="Consolas" w:cs="Consolas" w:eastAsia="Consolas" w:hAnsi="Consolas"/>
+          <w:shd w:fill="F1F5F9" w:color="F1F5F9" w:val="solid"/>
+        </w:rPr>
+        <w:t xml:space="preserve">[DEV]</w:t>
+      </w:r>
+      <w:r>
+        <w:t xml:space="preserve"> etiketiyle pino debug seviyesinde basılır.</w:t>
+      </w:r>
+    </w:p>
+    <w:p>
+      <w:pPr>
+        <w:pStyle w:val="Heading3"/>
+        <w:spacing w:after="120" w:before="240"/>
+      </w:pPr>
+      <w:r>
+        <w:t xml:space="preserve">21.2 Yeni Görsel Kimlik</w:t>
+      </w:r>
+    </w:p>
+    <w:p>
+      <w:pPr>
+        <w:spacing w:after="60"/>
+        <w:ind w:left="360"/>
+      </w:pPr>
+      <w:r>
+        <w:t xml:space="preserve">•  </w:t>
+      </w:r>
+      <w:r>
+        <w:rPr>
+          <w:b/>
+          <w:bCs/>
+        </w:rPr>
+        <w:t xml:space="preserve">`BrandIcon`</w:t>
+      </w:r>
+      <w:r>
+        <w:t xml:space="preserve"> bileşeni: Mavi gradyan T+365 chip SVG (</w:t>
+      </w:r>
+      <w:r>
+        <w:rPr>
+          <w:rFonts w:ascii="Consolas" w:cs="Consolas" w:eastAsia="Consolas" w:hAnsi="Consolas"/>
+          <w:shd w:fill="F1F5F9" w:color="F1F5F9" w:val="solid"/>
+        </w:rPr>
+        <w:t xml:space="preserve">artifacts/prosan/src/components/brand-icon.tsx</w:t>
+      </w:r>
+      <w:r>
+        <w:t xml:space="preserve">). Header, login, public nav, manifest icon ve favicon hepsinde tek kaynak.</w:t>
+      </w:r>
+    </w:p>
+    <w:p>
+      <w:pPr>
+        <w:spacing w:after="60"/>
+        <w:ind w:left="360"/>
+      </w:pPr>
+      <w:r>
+        <w:t xml:space="preserve">•  </w:t>
+      </w:r>
+      <w:r>
+        <w:rPr>
+          <w:b/>
+          <w:bCs/>
+        </w:rPr>
+        <w:t xml:space="preserve">Tema:</w:t>
+      </w:r>
+      <w:r>
+        <w:t xml:space="preserve"> Login + Şifremi Unuttum + Public Nav beyaz/açık-mavi paletine alındı (önceki koyu/lacivert agresif kontrast yumuşatıldı).</w:t>
+      </w:r>
+    </w:p>
+    <w:p>
+      <w:pPr>
+        <w:spacing w:after="60"/>
+        <w:ind w:left="360"/>
+      </w:pPr>
+      <w:r>
+        <w:t xml:space="preserve">•  </w:t>
+      </w:r>
+      <w:r>
+        <w:rPr>
+          <w:b/>
+          <w:bCs/>
+        </w:rPr>
+        <w:t xml:space="preserve">PublicNav rewrite:</w:t>
+      </w:r>
+      <w:r>
+        <w:t xml:space="preserve"> Sticky, beyaz arka plan, mavi accent, sade tipografi.</w:t>
+      </w:r>
+    </w:p>
+    <w:p>
+      <w:pPr>
+        <w:pStyle w:val="Heading3"/>
+        <w:spacing w:after="120" w:before="240"/>
+      </w:pPr>
+      <w:r>
+        <w:t xml:space="preserve">21.3 Auth Context Bug Fix</w:t>
+      </w:r>
+    </w:p>
+    <w:p>
+      <w:pPr>
+        <w:spacing w:after="120"/>
+      </w:pPr>
+      <w:r>
+        <w:rPr>
+          <w:rFonts w:ascii="Consolas" w:cs="Consolas" w:eastAsia="Consolas" w:hAnsi="Consolas"/>
+          <w:shd w:fill="F1F5F9" w:color="F1F5F9" w:val="solid"/>
+        </w:rPr>
+        <w:t xml:space="preserve">artifacts/prosan/src/components/auth-context.tsx</w:t>
+      </w:r>
+      <w:r>
+        <w:t xml:space="preserve"> içindeki </w:t>
+      </w:r>
+      <w:r>
+        <w:rPr>
+          <w:rFonts w:ascii="Consolas" w:cs="Consolas" w:eastAsia="Consolas" w:hAnsi="Consolas"/>
+          <w:shd w:fill="F1F5F9" w:color="F1F5F9" w:val="solid"/>
+        </w:rPr>
+        <w:t xml:space="preserve">publicPaths</w:t>
+      </w:r>
+      <w:r>
+        <w:t xml:space="preserve"> listesine </w:t>
+      </w:r>
+      <w:r>
+        <w:rPr>
+          <w:rFonts w:ascii="Consolas" w:cs="Consolas" w:eastAsia="Consolas" w:hAnsi="Consolas"/>
+          <w:shd w:fill="F1F5F9" w:color="F1F5F9" w:val="solid"/>
+        </w:rPr>
+        <w:t xml:space="preserve">/sifremi-unuttum</w:t>
+      </w:r>
+      <w:r>
+        <w:t xml:space="preserve">, </w:t>
+      </w:r>
+      <w:r>
+        <w:rPr>
+          <w:rFonts w:ascii="Consolas" w:cs="Consolas" w:eastAsia="Consolas" w:hAnsi="Consolas"/>
+          <w:shd w:fill="F1F5F9" w:color="F1F5F9" w:val="solid"/>
+        </w:rPr>
+        <w:t xml:space="preserve">/forgot-password</w:t>
+      </w:r>
+      <w:r>
+        <w:t xml:space="preserve">, </w:t>
+      </w:r>
+      <w:r>
+        <w:rPr>
+          <w:rFonts w:ascii="Consolas" w:cs="Consolas" w:eastAsia="Consolas" w:hAnsi="Consolas"/>
+          <w:shd w:fill="F1F5F9" w:color="F1F5F9" w:val="solid"/>
+        </w:rPr>
+        <w:t xml:space="preserve">/kvkk</w:t>
+      </w:r>
+      <w:r>
+        <w:t xml:space="preserve"> eklendi. Önceden bu sayfalara doğrudan girildiğinde 401 dönüp login'e atılıyordu (sonsuz redirect ihtimali).</w:t>
+      </w:r>
+    </w:p>
+    <w:p>
+      <w:pPr>
+        <w:pStyle w:val="Heading3"/>
+        <w:spacing w:after="120" w:before="240"/>
+      </w:pPr>
+      <w:r>
+        <w:t xml:space="preserve">21.4 Ekran Görüntüsü Teslimat Altyapısı</w:t>
+      </w:r>
+    </w:p>
+    <w:p>
+      <w:pPr>
+        <w:spacing w:after="120"/>
+      </w:pPr>
+      <w:r>
+        <w:t xml:space="preserve">Sunum/dokümantasyon için 130 ekran görüntüsü (65 masaüstü 1440×900 + 65 mobil 414×896) toplandı.</w:t>
+      </w:r>
+    </w:p>
+    <w:p>
+      <w:pPr>
+        <w:spacing w:after="60"/>
+        <w:ind w:left="360"/>
+      </w:pPr>
+      <w:r>
+        <w:t xml:space="preserve">•  </w:t>
+      </w:r>
+      <w:r>
+        <w:rPr>
+          <w:b/>
+          <w:bCs/>
+        </w:rPr>
+        <w:t xml:space="preserve">Toplama scripti:</w:t>
+      </w:r>
+      <w:r>
+        <w:t xml:space="preserve"> </w:t>
+      </w:r>
+      <w:r>
+        <w:rPr>
+          <w:rFonts w:ascii="Consolas" w:cs="Consolas" w:eastAsia="Consolas" w:hAnsi="Consolas"/>
+          <w:shd w:fill="F1F5F9" w:color="F1F5F9" w:val="solid"/>
+        </w:rPr>
+        <w:t xml:space="preserve">scripts/capture-screenshots.mjs</w:t>
+      </w:r>
+      <w:r>
+        <w:t xml:space="preserve"> — Replit'in Playwright Chromium binary'sini (</w:t>
+      </w:r>
+      <w:r>
+        <w:rPr>
+          <w:rFonts w:ascii="Consolas" w:cs="Consolas" w:eastAsia="Consolas" w:hAnsi="Consolas"/>
+          <w:shd w:fill="F1F5F9" w:color="F1F5F9" w:val="solid"/>
+        </w:rPr>
+        <w:t xml:space="preserve">REPLIT_PLAYWRIGHT_CHROMIUM_EXECUTABLE</w:t>
+      </w:r>
+      <w:r>
+        <w:t xml:space="preserve">) </w:t>
+      </w:r>
+      <w:r>
+        <w:rPr>
+          <w:rFonts w:ascii="Consolas" w:cs="Consolas" w:eastAsia="Consolas" w:hAnsi="Consolas"/>
+          <w:shd w:fill="F1F5F9" w:color="F1F5F9" w:val="solid"/>
+        </w:rPr>
+        <w:t xml:space="preserve">puppeteer-core</w:t>
+      </w:r>
+      <w:r>
+        <w:t xml:space="preserve"> ile sürer. Tek seferlik login, ardından tüm rotaları gezer; idempotent (mevcut dosya varsa atlar — yeniden çalıştırılabilir).</w:t>
+      </w:r>
+    </w:p>
+    <w:p>
+      <w:pPr>
+        <w:spacing w:after="60"/>
+        <w:ind w:left="360"/>
+      </w:pPr>
+      <w:r>
+        <w:t xml:space="preserve">•  </w:t>
+      </w:r>
+      <w:r>
+        <w:rPr>
+          <w:b/>
+          <w:bCs/>
+        </w:rPr>
+        <w:t xml:space="preserve">Paketleme:</w:t>
+      </w:r>
+      <w:r>
+        <w:t xml:space="preserve"> Sistemde </w:t>
+      </w:r>
+      <w:r>
+        <w:rPr>
+          <w:rFonts w:ascii="Consolas" w:cs="Consolas" w:eastAsia="Consolas" w:hAnsi="Consolas"/>
+          <w:shd w:fill="F1F5F9" w:color="F1F5F9" w:val="solid"/>
+        </w:rPr>
+        <w:t xml:space="preserve">zip</w:t>
+      </w:r>
+      <w:r>
+        <w:t xml:space="preserve">/</w:t>
+      </w:r>
+      <w:r>
+        <w:rPr>
+          <w:rFonts w:ascii="Consolas" w:cs="Consolas" w:eastAsia="Consolas" w:hAnsi="Consolas"/>
+          <w:shd w:fill="F1F5F9" w:color="F1F5F9" w:val="solid"/>
+        </w:rPr>
+        <w:t xml:space="preserve">python3</w:t>
+      </w:r>
+      <w:r>
+        <w:t xml:space="preserve"> olmadığı için saf-Node ZIP yazıcı kullanıldı (</w:t>
+      </w:r>
+      <w:r>
+        <w:rPr>
+          <w:rFonts w:ascii="Consolas" w:cs="Consolas" w:eastAsia="Consolas" w:hAnsi="Consolas"/>
+          <w:shd w:fill="F1F5F9" w:color="F1F5F9" w:val="solid"/>
+        </w:rPr>
+        <w:t xml:space="preserve">/tmp/zipit.mjs</w:t>
+      </w:r>
+      <w:r>
+        <w:t xml:space="preserve">, </w:t>
+      </w:r>
+      <w:r>
+        <w:rPr>
+          <w:rFonts w:ascii="Consolas" w:cs="Consolas" w:eastAsia="Consolas" w:hAnsi="Consolas"/>
+          <w:shd w:fill="F1F5F9" w:color="F1F5F9" w:val="solid"/>
+        </w:rPr>
+        <w:t xml:space="preserve">zlib.deflateRawSync</w:t>
+      </w:r>
+      <w:r>
+        <w:t xml:space="preserve"> + manuel ZIP local/central directory header'ları).</w:t>
+      </w:r>
+    </w:p>
+    <w:p>
+      <w:pPr>
+        <w:spacing w:after="60"/>
+        <w:ind w:left="360"/>
+      </w:pPr>
+      <w:r>
+        <w:t xml:space="preserve">•  </w:t>
+      </w:r>
+      <w:r>
+        <w:rPr>
+          <w:b/>
+          <w:bCs/>
+        </w:rPr>
+        <w:t xml:space="preserve">Çıktı:</w:t>
+      </w:r>
+      <w:r>
+        <w:t xml:space="preserve"> </w:t>
+      </w:r>
+      <w:r>
+        <w:rPr>
+          <w:rFonts w:ascii="Consolas" w:cs="Consolas" w:eastAsia="Consolas" w:hAnsi="Consolas"/>
+          <w:shd w:fill="F1F5F9" w:color="F1F5F9" w:val="solid"/>
+        </w:rPr>
+        <w:t xml:space="preserve">screenshots/all/{desktop,mobile}/*.jpeg</w:t>
+      </w:r>
+      <w:r>
+        <w:t xml:space="preserve"> ve </w:t>
+      </w:r>
+      <w:r>
+        <w:rPr>
+          <w:rFonts w:ascii="Consolas" w:cs="Consolas" w:eastAsia="Consolas" w:hAnsi="Consolas"/>
+          <w:shd w:fill="F1F5F9" w:color="F1F5F9" w:val="solid"/>
+        </w:rPr>
+        <w:t xml:space="preserve">screenshots/ticarium365-all-screenshots.zip</w:t>
+      </w:r>
+      <w:r>
+        <w:t xml:space="preserve"> (~26 MB).</w:t>
+      </w:r>
+    </w:p>
+    <w:p>
+      <w:pPr>
+        <w:pStyle w:val="Heading3"/>
+        <w:spacing w:after="120" w:before="240"/>
+      </w:pPr>
+      <w:r>
+        <w:t xml:space="preserve">21.5 Sprint 82 Bekleyen İşler (Backlog)</w:t>
+      </w:r>
+    </w:p>
+    <w:p>
+      <w:pPr>
+        <w:spacing w:after="60"/>
+        <w:ind w:left="360"/>
+      </w:pPr>
+      <w:r>
+        <w:t xml:space="preserve">•  Logo/favicon güncellemesi tüm </w:t>
+      </w:r>
+      <w:r>
+        <w:rPr>
+          <w:rFonts w:ascii="Consolas" w:cs="Consolas" w:eastAsia="Consolas" w:hAnsi="Consolas"/>
+          <w:shd w:fill="F1F5F9" w:color="F1F5F9" w:val="solid"/>
+        </w:rPr>
+        <w:t xml:space="preserve">manifest.json</w:t>
+      </w:r>
+      <w:r>
+        <w:t xml:space="preserve"> + apple-touch-icon dosyalarına yayılacak</w:t>
+      </w:r>
+    </w:p>
+    <w:p>
+      <w:pPr>
+        <w:spacing w:after="60"/>
+        <w:ind w:left="360"/>
+      </w:pPr>
+      <w:r>
+        <w:t xml:space="preserve">•  Beyaz/mavi tema dashboard ve diğer iç sayfalara genişletilecek</w:t>
+      </w:r>
+    </w:p>
+    <w:p>
+      <w:pPr>
+        <w:spacing w:after="60"/>
+        <w:ind w:left="360"/>
+      </w:pPr>
+      <w:r>
+        <w:t xml:space="preserve">•  NetGSM canlı anahtarları geldiğinde gerçek SMS testi</w:t>
+      </w:r>
+    </w:p>
+    <w:p>
+      <w:pPr>
+        <w:spacing w:after="60"/>
+        <w:ind w:left="360"/>
+      </w:pPr>
+      <w:r>
+        <w:t xml:space="preserve">•  QNB / Trendyol / TCMB connector implementasyonları (anahtar bekleniyor)</w:t>
+      </w:r>
+    </w:p>
+    <w:p>
+      <w:pPr>
+        <w:spacing w:after="60"/>
+        <w:ind w:left="360"/>
+      </w:pPr>
+      <w:r>
+        <w:t xml:space="preserve">•  Domain &amp; hosting konfigürasyonu</w:t>
+      </w:r>
+    </w:p>
+    <w:p>
+      <w:pPr>
+        <w:pBdr>
+          <w:bottom w:val="single" w:color="CBD5E1" w:sz="6" w:space="1"/>
+        </w:pBdr>
+        <w:spacing w:after="120" w:before="120"/>
+      </w:pPr>
+      <w:r>
+        <w:t xml:space="preserve"/>
+      </w:r>
+    </w:p>
+    <w:p>
+      <w:pPr>
+        <w:pStyle w:val="Heading2"/>
+        <w:spacing w:after="120" w:before="240"/>
+      </w:pPr>
+      <w:r>
+        <w:t xml:space="preserve">22. Sürüm Geçmişi (Özet)</w:t>
+      </w:r>
+    </w:p>
+    <w:tbl>
+      <w:tblPr>
+        <w:tblW w:type="pct" w:w="100%"/>
+        <w:tblBorders>
+          <w:top w:val="single" w:color="CBD5E1" w:sz="4"/>
+          <w:left w:val="single" w:color="CBD5E1" w:sz="4"/>
+          <w:bottom w:val="single" w:color="CBD5E1" w:sz="4"/>
+          <w:right w:val="single" w:color="CBD5E1" w:sz="4"/>
+          <w:insideH w:val="single" w:color="E2E8F0" w:sz="2"/>
+          <w:insideV w:val="single" w:color="E2E8F0" w:sz="2"/>
+        </w:tblBorders>
+      </w:tblPr>
+      <w:tblGrid>
+        <w:gridCol w:w="100"/>
+        <w:gridCol w:w="100"/>
+        <w:gridCol w:w="100"/>
+      </w:tblGrid>
+      <w:tr>
+        <w:trPr>
+          <w:tblHeader/>
+        </w:trPr>
+        <w:tc>
+          <w:tcPr>
+            <w:tcW w:type="dxa" w:w="3000"/>
+            <w:shd w:fill="0F172A" w:color="0F172A" w:val="solid"/>
+          </w:tcPr>
+          <w:p>
+            <w:pPr>
+              <w:spacing w:after="60" w:before="60"/>
+            </w:pPr>
+            <w:r>
+              <w:rPr>
+                <w:b/>
+                <w:bCs/>
+              </w:rPr>
               <w:t xml:space="preserve">Sürüm</w:t>
             </w:r>
           </w:p>
@@ -8289,6 +9331,47 @@
                 <w:bCs/>
               </w:rPr>
               <w:t xml:space="preserve">Önemli Değişiklikler</w:t>
+            </w:r>
+          </w:p>
+        </w:tc>
+      </w:tr>
+      <w:tr>
+        <w:tc>
+          <w:tcPr>
+            <w:tcW w:type="dxa" w:w="3000"/>
+          </w:tcPr>
+          <w:p>
+            <w:pPr>
+              <w:spacing w:after="60" w:before="60"/>
+            </w:pPr>
+            <w:r>
+              <w:t xml:space="preserve">1.2.0</w:t>
+            </w:r>
+          </w:p>
+        </w:tc>
+        <w:tc>
+          <w:tcPr>
+            <w:tcW w:type="dxa" w:w="3000"/>
+          </w:tcPr>
+          <w:p>
+            <w:pPr>
+              <w:spacing w:after="60" w:before="60"/>
+            </w:pPr>
+            <w:r>
+              <w:t xml:space="preserve">2026-04-18</w:t>
+            </w:r>
+          </w:p>
+        </w:tc>
+        <w:tc>
+          <w:tcPr>
+            <w:tcW w:type="dxa" w:w="3000"/>
+          </w:tcPr>
+          <w:p>
+            <w:pPr>
+              <w:spacing w:after="60" w:before="60"/>
+            </w:pPr>
+            <w:r>
+              <w:t xml:space="preserve">Sprint 82: SMS tabanlı şifre sıfırlama (3 endpoint + rate-limit + atomic token), beyaz/mavi auth UI, BrandIcon SVG, PublicNav rewrite, 130-ekran capture pipeline (puppeteer-core + saf-Node ZIP)</w:t>
             </w:r>
           </w:p>
         </w:tc>

</xml_diff>